<commit_message>
Magasin Location : CodeRegion (France) / CodeLand (Allemagne), Gemeinde, TypeKreis, TypeLand ; agregats et dictionnaire alignes
Co-Authored-By: Claude Sonnet 5.5 <noreply@anthropic.com>
Claude-Session: https://claude.ai/code/session_01DCpKdazzv8zUzKmMSEAPKH
</commit_message>
<xml_diff>
--- a/docs/Dictionnaire_Location_MD.docx
+++ b/docs/Dictionnaire_Location_MD.docx
@@ -152,7 +152,21 @@
               <w:rPr>
                 <w:sz w:val="18"/>
               </w:rPr>
-              <w:t>Pilotage des locations : analyse hebdomadaire, mensuelle et annuelle de la durée, du montant au prix public (sans réduction) et du montant réellement payé (réductions comprises) des locations, selon les exemplaires de produits et les employés (profil, classe de trajet, géographie de leur société, quel que soit le pays).</w:t>
+              <w:t xml:space="preserve">Pilotage des </w:t>
+            </w:r>
+            <w:proofErr w:type="gramStart"/>
+            <w:r>
+              <w:rPr>
+                <w:sz w:val="18"/>
+              </w:rPr>
+              <w:t>locations :</w:t>
+            </w:r>
+            <w:proofErr w:type="gramEnd"/>
+            <w:r>
+              <w:rPr>
+                <w:sz w:val="18"/>
+              </w:rPr>
+              <w:t xml:space="preserve"> analyse hebdomadaire, mensuelle et annuelle de la durée, du montant au prix public (sans réduction) et du montant réellement payé (réductions comprises) des locations, selon les exemplaires de produits et les employés (profil, classe de trajet, géographie de leur société, quel que soit le pays).</w:t>
             </w:r>
           </w:p>
         </w:tc>
@@ -161,11 +175,19 @@
             <w:tcW w:w="2948" w:type="dxa"/>
           </w:tcPr>
           <w:p>
-            <w:r>
-              <w:rPr>
-                <w:sz w:val="18"/>
-              </w:rPr>
-              <w:t>B1.1 : Montants des locations réellement payés, par mois et par société</w:t>
+            <w:proofErr w:type="gramStart"/>
+            <w:r>
+              <w:rPr>
+                <w:sz w:val="18"/>
+              </w:rPr>
+              <w:t>B1.1 :</w:t>
+            </w:r>
+            <w:proofErr w:type="gramEnd"/>
+            <w:r>
+              <w:rPr>
+                <w:sz w:val="18"/>
+              </w:rPr>
+              <w:t xml:space="preserve"> Montants des locations réellement payés, par mois et par société</w:t>
             </w:r>
           </w:p>
         </w:tc>
@@ -210,11 +232,19 @@
             <w:tcW w:w="2948" w:type="dxa"/>
           </w:tcPr>
           <w:p>
-            <w:r>
-              <w:rPr>
-                <w:sz w:val="18"/>
-              </w:rPr>
-              <w:t>B1.2 : Montants réellement payés et durées des locations, par semaine et par salarié</w:t>
+            <w:proofErr w:type="gramStart"/>
+            <w:r>
+              <w:rPr>
+                <w:sz w:val="18"/>
+              </w:rPr>
+              <w:t>B1.2 :</w:t>
+            </w:r>
+            <w:proofErr w:type="gramEnd"/>
+            <w:r>
+              <w:rPr>
+                <w:sz w:val="18"/>
+              </w:rPr>
+              <w:t xml:space="preserve"> Montants réellement payés et durées des locations, par semaine et par salarié</w:t>
             </w:r>
           </w:p>
         </w:tc>
@@ -259,11 +289,19 @@
             <w:tcW w:w="2948" w:type="dxa"/>
           </w:tcPr>
           <w:p>
-            <w:r>
-              <w:rPr>
-                <w:sz w:val="18"/>
-              </w:rPr>
-              <w:t>B1.3 : Durées des locations, par mois et par région (France) ou Land (Allemagne)</w:t>
+            <w:proofErr w:type="gramStart"/>
+            <w:r>
+              <w:rPr>
+                <w:sz w:val="18"/>
+              </w:rPr>
+              <w:t>B1.3 :</w:t>
+            </w:r>
+            <w:proofErr w:type="gramEnd"/>
+            <w:r>
+              <w:rPr>
+                <w:sz w:val="18"/>
+              </w:rPr>
+              <w:t xml:space="preserve"> Durées des locations, par mois et par région (France) ou Land (Allemagne)</w:t>
             </w:r>
           </w:p>
         </w:tc>
@@ -308,11 +346,33 @@
             <w:tcW w:w="2948" w:type="dxa"/>
           </w:tcPr>
           <w:p>
-            <w:r>
-              <w:rPr>
-                <w:sz w:val="18"/>
-              </w:rPr>
-              <w:t>B1.4 : Graphique associé à B1.3 : durées mensuelles des locations par région ou Land</w:t>
+            <w:proofErr w:type="gramStart"/>
+            <w:r>
+              <w:rPr>
+                <w:sz w:val="18"/>
+              </w:rPr>
+              <w:t>B1.4 :</w:t>
+            </w:r>
+            <w:proofErr w:type="gramEnd"/>
+            <w:r>
+              <w:rPr>
+                <w:sz w:val="18"/>
+              </w:rPr>
+              <w:t xml:space="preserve"> Graphique associé à </w:t>
+            </w:r>
+            <w:proofErr w:type="gramStart"/>
+            <w:r>
+              <w:rPr>
+                <w:sz w:val="18"/>
+              </w:rPr>
+              <w:t>B1.3 :</w:t>
+            </w:r>
+            <w:proofErr w:type="gramEnd"/>
+            <w:r>
+              <w:rPr>
+                <w:sz w:val="18"/>
+              </w:rPr>
+              <w:t xml:space="preserve"> durées mensuelles des locations par région ou Land</w:t>
             </w:r>
           </w:p>
         </w:tc>
@@ -334,7 +394,15 @@
     <w:p/>
     <w:p>
       <w:r>
-        <w:t>Ces analyses sont utilisées quotidiennement. Le décideur n'est pas informaticien : il attend des temps de réponse très rapides et une restitution accessible sans langage de requêtes (agrégats pré-calculés et outil de reporting).</w:t>
+        <w:t xml:space="preserve">Ces analyses sont utilisées quotidiennement. Le décideur n'est pas </w:t>
+      </w:r>
+      <w:proofErr w:type="gramStart"/>
+      <w:r>
+        <w:t>informaticien :</w:t>
+      </w:r>
+      <w:proofErr w:type="gramEnd"/>
+      <w:r>
+        <w:t xml:space="preserve"> il attend des temps de réponse très rapides et une restitution accessible sans langage de requêtes (agrégats pré-calculés et outil de reporting).</w:t>
       </w:r>
     </w:p>
     <w:p>
@@ -472,7 +540,21 @@
               <w:rPr>
                 <w:sz w:val="18"/>
               </w:rPr>
-              <w:t>= SUM(Louer.Duree_Loc)</w:t>
+              <w:t xml:space="preserve">= </w:t>
+            </w:r>
+            <w:proofErr w:type="gramStart"/>
+            <w:r>
+              <w:rPr>
+                <w:sz w:val="18"/>
+              </w:rPr>
+              <w:t>SUM(</w:t>
+            </w:r>
+            <w:proofErr w:type="gramEnd"/>
+            <w:r>
+              <w:rPr>
+                <w:sz w:val="18"/>
+              </w:rPr>
+              <w:t>Louer.Duree_Loc)</w:t>
             </w:r>
           </w:p>
         </w:tc>
@@ -535,11 +617,19 @@
               </w:rPr>
               <w:t xml:space="preserve">= </w:t>
             </w:r>
-            <w:r>
-              <w:rPr>
-                <w:sz w:val="18"/>
-              </w:rPr>
-              <w:t xml:space="preserve">SUM(CASE WHEN </w:t>
+            <w:proofErr w:type="gramStart"/>
+            <w:r>
+              <w:rPr>
+                <w:sz w:val="18"/>
+              </w:rPr>
+              <w:t>SUM(</w:t>
+            </w:r>
+            <w:proofErr w:type="gramEnd"/>
+            <w:r>
+              <w:rPr>
+                <w:sz w:val="18"/>
+              </w:rPr>
+              <w:t xml:space="preserve">CASE WHEN </w:t>
             </w:r>
             <w:proofErr w:type="spellStart"/>
             <w:r>
@@ -686,11 +776,19 @@
               </w:rPr>
               <w:t xml:space="preserve">= </w:t>
             </w:r>
-            <w:r>
-              <w:rPr>
-                <w:sz w:val="18"/>
-              </w:rPr>
-              <w:t xml:space="preserve">SUM(CASE WHEN </w:t>
+            <w:proofErr w:type="gramStart"/>
+            <w:r>
+              <w:rPr>
+                <w:sz w:val="18"/>
+              </w:rPr>
+              <w:t>SUM(</w:t>
+            </w:r>
+            <w:proofErr w:type="gramEnd"/>
+            <w:r>
+              <w:rPr>
+                <w:sz w:val="18"/>
+              </w:rPr>
+              <w:t xml:space="preserve">CASE WHEN </w:t>
             </w:r>
             <w:proofErr w:type="spellStart"/>
             <w:r>
@@ -774,9 +872,17 @@
               <w:rPr>
                 <w:sz w:val="18"/>
               </w:rPr>
-              <w:t xml:space="preserve"> END * (1 - NVL(</w:t>
+              <w:t xml:space="preserve"> END * (1 - </w:t>
+            </w:r>
+            <w:proofErr w:type="gramStart"/>
+            <w:r>
+              <w:rPr>
+                <w:sz w:val="18"/>
+              </w:rPr>
+              <w:t>NVL(</w:t>
             </w:r>
             <w:proofErr w:type="spellStart"/>
+            <w:proofErr w:type="gramEnd"/>
             <w:r>
               <w:rPr>
                 <w:sz w:val="18"/>
@@ -797,7 +903,23 @@
     <w:p/>
     <w:p>
       <w:r>
-        <w:t>Les trois mesures sont additives : elles sont analysées par semaine, par mois et par année, par SUM. Le fait est stocké au jour de début de la location (niveau le plus fin de Temps_MD, nécessaire parce que les semaines ne s'emboîtent pas dans les mois). La somme par semaine, par mois ou par année est calculée à l'agrégation (agrégats AGG_SEM_EMPLOYE, AGG_MOIS_SOCIETE, AGG_MOIS_REGION).</w:t>
+        <w:t xml:space="preserve">Les trois mesures sont </w:t>
+      </w:r>
+      <w:proofErr w:type="gramStart"/>
+      <w:r>
+        <w:t>additives :</w:t>
+      </w:r>
+      <w:proofErr w:type="gramEnd"/>
+      <w:r>
+        <w:t xml:space="preserve"> elles sont analysées par semaine, par mois et par année, par SUM. Le fait est stocké au jour de début de la location (niveau le plus </w:t>
+      </w:r>
+      <w:proofErr w:type="gramStart"/>
+      <w:r>
+        <w:t>fin</w:t>
+      </w:r>
+      <w:proofErr w:type="gramEnd"/>
+      <w:r>
+        <w:t xml:space="preserve"> de Temps_MD, nécessaire parce que les semaines ne s'emboîtent pas dans les mois). La somme par semaine, par mois ou par année est calculée à l'agrégation (agrégats AGG_SEM_EMPLOYE, AGG_MOIS_SOCIETE, AGG_MOIS_REGION).</w:t>
       </w:r>
     </w:p>
     <w:p>
@@ -811,7 +933,23 @@
     </w:p>
     <w:p>
       <w:r>
-        <w:t>Code = Dimension.attribut ; Type = type Oracle ; Source = Table.attribut de l'ED, avec la fonction Oracle quand elle est utilisée. Pour la géographie, la zone du niveau indiqué est celle obtenue en remontant Zone_Geo.CodeZG_zone_englobante depuis Societe.CodeZG.</w:t>
+        <w:t xml:space="preserve">Code = </w:t>
+      </w:r>
+      <w:proofErr w:type="gramStart"/>
+      <w:r>
+        <w:t>Dimension.attribut ;</w:t>
+      </w:r>
+      <w:proofErr w:type="gramEnd"/>
+      <w:r>
+        <w:t xml:space="preserve"> Type = type </w:t>
+      </w:r>
+      <w:proofErr w:type="gramStart"/>
+      <w:r>
+        <w:t>Oracle ;</w:t>
+      </w:r>
+      <w:proofErr w:type="gramEnd"/>
+      <w:r>
+        <w:t xml:space="preserve"> Source = Table.attribut de l'ED, avec la fonction Oracle quand elle est utilisée. Pour la géographie, la zone du niveau indiqué est celle obtenue en remontant Zone_Geo.CodeZG_zone_englobante depuis Societe.CodeZG.</w:t>
       </w:r>
     </w:p>
     <w:p>
@@ -910,8 +1048,16 @@
               <w:rPr>
                 <w:sz w:val="18"/>
               </w:rPr>
-              <w:t>Temps_MD.DateJ</w:t>
-            </w:r>
+              <w:t>Temps_</w:t>
+            </w:r>
+            <w:proofErr w:type="gramStart"/>
+            <w:r>
+              <w:rPr>
+                <w:sz w:val="18"/>
+              </w:rPr>
+              <w:t>MD.DateJ</w:t>
+            </w:r>
+            <w:proofErr w:type="gramEnd"/>
           </w:p>
         </w:tc>
         <w:tc>
@@ -923,7 +1069,21 @@
               <w:rPr>
                 <w:sz w:val="18"/>
               </w:rPr>
-              <w:t>Jour de début de la location (niveau « Date » du schéma ; DATE est un mot réservé Oracle)</w:t>
+              <w:t xml:space="preserve">Jour de début de la location (niveau « Date » du </w:t>
+            </w:r>
+            <w:proofErr w:type="gramStart"/>
+            <w:r>
+              <w:rPr>
+                <w:sz w:val="18"/>
+              </w:rPr>
+              <w:t>schéma ;</w:t>
+            </w:r>
+            <w:proofErr w:type="gramEnd"/>
+            <w:r>
+              <w:rPr>
+                <w:sz w:val="18"/>
+              </w:rPr>
+              <w:t xml:space="preserve"> DATE est un mot réservé Oracle)</w:t>
             </w:r>
           </w:p>
         </w:tc>
@@ -964,7 +1124,21 @@
               <w:rPr>
                 <w:sz w:val="18"/>
               </w:rPr>
-              <w:t>Temps_MD.Num_Semaine</w:t>
+              <w:t>Temps_</w:t>
+            </w:r>
+            <w:proofErr w:type="gramStart"/>
+            <w:r>
+              <w:rPr>
+                <w:sz w:val="18"/>
+              </w:rPr>
+              <w:t>MD.Num</w:t>
+            </w:r>
+            <w:proofErr w:type="gramEnd"/>
+            <w:r>
+              <w:rPr>
+                <w:sz w:val="18"/>
+              </w:rPr>
+              <w:t>_Semaine</w:t>
             </w:r>
           </w:p>
         </w:tc>
@@ -977,7 +1151,21 @@
               <w:rPr>
                 <w:sz w:val="18"/>
               </w:rPr>
-              <w:t>Semaine ISO, au format AAAA-Snn (ex. 2026-S03) ; l'année est l'année ISO</w:t>
+              <w:t>Semaine ISO, au format AAAA-Snn (ex. 2026-S03</w:t>
+            </w:r>
+            <w:proofErr w:type="gramStart"/>
+            <w:r>
+              <w:rPr>
+                <w:sz w:val="18"/>
+              </w:rPr>
+              <w:t>) ;</w:t>
+            </w:r>
+            <w:proofErr w:type="gramEnd"/>
+            <w:r>
+              <w:rPr>
+                <w:sz w:val="18"/>
+              </w:rPr>
+              <w:t xml:space="preserve"> l'année est l'année ISO</w:t>
             </w:r>
           </w:p>
         </w:tc>
@@ -1003,7 +1191,21 @@
               <w:rPr>
                 <w:sz w:val="18"/>
               </w:rPr>
-              <w:t>TO_CHAR(Louer.DateL, 'IYYY-"S"IW')</w:t>
+              <w:t>TO_</w:t>
+            </w:r>
+            <w:proofErr w:type="gramStart"/>
+            <w:r>
+              <w:rPr>
+                <w:sz w:val="18"/>
+              </w:rPr>
+              <w:t>CHAR(</w:t>
+            </w:r>
+            <w:proofErr w:type="gramEnd"/>
+            <w:r>
+              <w:rPr>
+                <w:sz w:val="18"/>
+              </w:rPr>
+              <w:t>Louer.DateL, 'IYYY-"S"IW')</w:t>
             </w:r>
           </w:p>
         </w:tc>
@@ -1018,7 +1220,21 @@
               <w:rPr>
                 <w:sz w:val="18"/>
               </w:rPr>
-              <w:t>Temps_MD.Annee_ISO</w:t>
+              <w:t>Temps_</w:t>
+            </w:r>
+            <w:proofErr w:type="gramStart"/>
+            <w:r>
+              <w:rPr>
+                <w:sz w:val="18"/>
+              </w:rPr>
+              <w:t>MD.Annee</w:t>
+            </w:r>
+            <w:proofErr w:type="gramEnd"/>
+            <w:r>
+              <w:rPr>
+                <w:sz w:val="18"/>
+              </w:rPr>
+              <w:t>_ISO</w:t>
             </w:r>
           </w:p>
         </w:tc>
@@ -1040,11 +1256,19 @@
             <w:tcW w:w="1474" w:type="dxa"/>
           </w:tcPr>
           <w:p>
-            <w:r>
-              <w:rPr>
-                <w:sz w:val="18"/>
-              </w:rPr>
-              <w:t>NUMBER(4)</w:t>
+            <w:proofErr w:type="gramStart"/>
+            <w:r>
+              <w:rPr>
+                <w:sz w:val="18"/>
+              </w:rPr>
+              <w:t>NUMBER(</w:t>
+            </w:r>
+            <w:proofErr w:type="gramEnd"/>
+            <w:r>
+              <w:rPr>
+                <w:sz w:val="18"/>
+              </w:rPr>
+              <w:t>4)</w:t>
             </w:r>
           </w:p>
         </w:tc>
@@ -1057,7 +1281,35 @@
               <w:rPr>
                 <w:sz w:val="18"/>
               </w:rPr>
-              <w:t>TO_NUMBER(TO_CHAR(Louer.DateL, 'IYYY'))</w:t>
+              <w:t>TO_</w:t>
+            </w:r>
+            <w:proofErr w:type="gramStart"/>
+            <w:r>
+              <w:rPr>
+                <w:sz w:val="18"/>
+              </w:rPr>
+              <w:t>NUMBER(</w:t>
+            </w:r>
+            <w:proofErr w:type="gramEnd"/>
+            <w:r>
+              <w:rPr>
+                <w:sz w:val="18"/>
+              </w:rPr>
+              <w:t>TO_</w:t>
+            </w:r>
+            <w:proofErr w:type="gramStart"/>
+            <w:r>
+              <w:rPr>
+                <w:sz w:val="18"/>
+              </w:rPr>
+              <w:t>CHAR(</w:t>
+            </w:r>
+            <w:proofErr w:type="gramEnd"/>
+            <w:r>
+              <w:rPr>
+                <w:sz w:val="18"/>
+              </w:rPr>
+              <w:t>Louer.DateL, 'IYYY'))</w:t>
             </w:r>
           </w:p>
         </w:tc>
@@ -1072,7 +1324,21 @@
               <w:rPr>
                 <w:sz w:val="18"/>
               </w:rPr>
-              <w:t>Temps_MD.Num_Mois</w:t>
+              <w:t>Temps_</w:t>
+            </w:r>
+            <w:proofErr w:type="gramStart"/>
+            <w:r>
+              <w:rPr>
+                <w:sz w:val="18"/>
+              </w:rPr>
+              <w:t>MD.Num</w:t>
+            </w:r>
+            <w:proofErr w:type="gramEnd"/>
+            <w:r>
+              <w:rPr>
+                <w:sz w:val="18"/>
+              </w:rPr>
+              <w:t>_Mois</w:t>
             </w:r>
           </w:p>
         </w:tc>
@@ -1111,7 +1377,21 @@
               <w:rPr>
                 <w:sz w:val="18"/>
               </w:rPr>
-              <w:t>TO_CHAR(Louer.DateL, 'YYYY-MM')</w:t>
+              <w:t>TO_</w:t>
+            </w:r>
+            <w:proofErr w:type="gramStart"/>
+            <w:r>
+              <w:rPr>
+                <w:sz w:val="18"/>
+              </w:rPr>
+              <w:t>CHAR(</w:t>
+            </w:r>
+            <w:proofErr w:type="gramEnd"/>
+            <w:r>
+              <w:rPr>
+                <w:sz w:val="18"/>
+              </w:rPr>
+              <w:t>Louer.DateL, 'YYYY-MM')</w:t>
             </w:r>
           </w:p>
         </w:tc>
@@ -1126,8 +1406,16 @@
               <w:rPr>
                 <w:sz w:val="18"/>
               </w:rPr>
-              <w:t>Temps_MD.LibMois</w:t>
-            </w:r>
+              <w:t>Temps_</w:t>
+            </w:r>
+            <w:proofErr w:type="gramStart"/>
+            <w:r>
+              <w:rPr>
+                <w:sz w:val="18"/>
+              </w:rPr>
+              <w:t>MD.LibMois</w:t>
+            </w:r>
+            <w:proofErr w:type="gramEnd"/>
           </w:p>
         </w:tc>
         <w:tc>
@@ -1165,7 +1453,21 @@
               <w:rPr>
                 <w:sz w:val="18"/>
               </w:rPr>
-              <w:t>TO_CHAR(Louer.DateL, 'fmMonth YYYY', 'NLS_DATE_LANGUAGE=FRENCH')</w:t>
+              <w:t>TO_</w:t>
+            </w:r>
+            <w:proofErr w:type="gramStart"/>
+            <w:r>
+              <w:rPr>
+                <w:sz w:val="18"/>
+              </w:rPr>
+              <w:t>CHAR(</w:t>
+            </w:r>
+            <w:proofErr w:type="gramEnd"/>
+            <w:r>
+              <w:rPr>
+                <w:sz w:val="18"/>
+              </w:rPr>
+              <w:t>Louer.DateL, 'fmMonth YYYY', 'NLS_DATE_LANGUAGE=FRENCH')</w:t>
             </w:r>
           </w:p>
         </w:tc>
@@ -1180,8 +1482,16 @@
               <w:rPr>
                 <w:sz w:val="18"/>
               </w:rPr>
-              <w:t>Temps_MD.Annee</w:t>
-            </w:r>
+              <w:t>Temps_</w:t>
+            </w:r>
+            <w:proofErr w:type="gramStart"/>
+            <w:r>
+              <w:rPr>
+                <w:sz w:val="18"/>
+              </w:rPr>
+              <w:t>MD.Annee</w:t>
+            </w:r>
+            <w:proofErr w:type="gramEnd"/>
           </w:p>
         </w:tc>
         <w:tc>
@@ -1202,11 +1512,19 @@
             <w:tcW w:w="1474" w:type="dxa"/>
           </w:tcPr>
           <w:p>
-            <w:r>
-              <w:rPr>
-                <w:sz w:val="18"/>
-              </w:rPr>
-              <w:t>NUMBER(4)</w:t>
+            <w:proofErr w:type="gramStart"/>
+            <w:r>
+              <w:rPr>
+                <w:sz w:val="18"/>
+              </w:rPr>
+              <w:t>NUMBER(</w:t>
+            </w:r>
+            <w:proofErr w:type="gramEnd"/>
+            <w:r>
+              <w:rPr>
+                <w:sz w:val="18"/>
+              </w:rPr>
+              <w:t>4)</w:t>
             </w:r>
           </w:p>
         </w:tc>
@@ -1215,11 +1533,19 @@
             <w:tcW w:w="2381" w:type="dxa"/>
           </w:tcPr>
           <w:p>
-            <w:r>
-              <w:rPr>
-                <w:sz w:val="18"/>
-              </w:rPr>
-              <w:t>EXTRACT(YEAR FROM Louer.DateL)</w:t>
+            <w:proofErr w:type="gramStart"/>
+            <w:r>
+              <w:rPr>
+                <w:sz w:val="18"/>
+              </w:rPr>
+              <w:t>EXTRACT(</w:t>
+            </w:r>
+            <w:proofErr w:type="gramEnd"/>
+            <w:r>
+              <w:rPr>
+                <w:sz w:val="18"/>
+              </w:rPr>
+              <w:t>YEAR FROM Louer.DateL)</w:t>
             </w:r>
           </w:p>
         </w:tc>
@@ -1244,7 +1570,7 @@
         <w:gridCol w:w="2608"/>
         <w:gridCol w:w="3628"/>
         <w:gridCol w:w="1474"/>
-        <w:gridCol w:w="2390"/>
+        <w:gridCol w:w="2381"/>
       </w:tblGrid>
       <w:tr>
         <w:tc>
@@ -1322,8 +1648,16 @@
               <w:rPr>
                 <w:sz w:val="18"/>
               </w:rPr>
-              <w:t>Employe_MD.CodeEmploye</w:t>
-            </w:r>
+              <w:t>Employe_</w:t>
+            </w:r>
+            <w:proofErr w:type="gramStart"/>
+            <w:r>
+              <w:rPr>
+                <w:sz w:val="18"/>
+              </w:rPr>
+              <w:t>MD.CodeEmploye</w:t>
+            </w:r>
+            <w:proofErr w:type="gramEnd"/>
           </w:p>
         </w:tc>
         <w:tc>
@@ -1344,11 +1678,19 @@
             <w:tcW w:w="1474" w:type="dxa"/>
           </w:tcPr>
           <w:p>
-            <w:r>
-              <w:rPr>
-                <w:sz w:val="18"/>
-              </w:rPr>
-              <w:t>NUMBER(10)</w:t>
+            <w:proofErr w:type="gramStart"/>
+            <w:r>
+              <w:rPr>
+                <w:sz w:val="18"/>
+              </w:rPr>
+              <w:t>NUMBER(</w:t>
+            </w:r>
+            <w:proofErr w:type="gramEnd"/>
+            <w:r>
+              <w:rPr>
+                <w:sz w:val="18"/>
+              </w:rPr>
+              <w:t>10)</w:t>
             </w:r>
           </w:p>
         </w:tc>
@@ -1376,8 +1718,16 @@
               <w:rPr>
                 <w:sz w:val="18"/>
               </w:rPr>
-              <w:t>Employe_MD.NomEmploye</w:t>
-            </w:r>
+              <w:t>Employe_</w:t>
+            </w:r>
+            <w:proofErr w:type="gramStart"/>
+            <w:r>
+              <w:rPr>
+                <w:sz w:val="18"/>
+              </w:rPr>
+              <w:t>MD.NomEmploye</w:t>
+            </w:r>
+            <w:proofErr w:type="gramEnd"/>
           </w:p>
         </w:tc>
         <w:tc>
@@ -1430,8 +1780,16 @@
               <w:rPr>
                 <w:sz w:val="18"/>
               </w:rPr>
-              <w:t>Employe_MD.PrenomEmploye</w:t>
-            </w:r>
+              <w:t>Employe_</w:t>
+            </w:r>
+            <w:proofErr w:type="gramStart"/>
+            <w:r>
+              <w:rPr>
+                <w:sz w:val="18"/>
+              </w:rPr>
+              <w:t>MD.PrenomEmploye</w:t>
+            </w:r>
+            <w:proofErr w:type="gramEnd"/>
           </w:p>
         </w:tc>
         <w:tc>
@@ -1484,8 +1842,16 @@
               <w:rPr>
                 <w:sz w:val="18"/>
               </w:rPr>
-              <w:t>Employe_MD.CodeCategorie</w:t>
-            </w:r>
+              <w:t>Employe_</w:t>
+            </w:r>
+            <w:proofErr w:type="gramStart"/>
+            <w:r>
+              <w:rPr>
+                <w:sz w:val="18"/>
+              </w:rPr>
+              <w:t>MD.CodeCategorie</w:t>
+            </w:r>
+            <w:proofErr w:type="gramEnd"/>
           </w:p>
         </w:tc>
         <w:tc>
@@ -1506,11 +1872,19 @@
             <w:tcW w:w="1474" w:type="dxa"/>
           </w:tcPr>
           <w:p>
-            <w:r>
-              <w:rPr>
-                <w:sz w:val="18"/>
-              </w:rPr>
-              <w:t>CHAR(5)</w:t>
+            <w:proofErr w:type="gramStart"/>
+            <w:r>
+              <w:rPr>
+                <w:sz w:val="18"/>
+              </w:rPr>
+              <w:t>CHAR(</w:t>
+            </w:r>
+            <w:proofErr w:type="gramEnd"/>
+            <w:r>
+              <w:rPr>
+                <w:sz w:val="18"/>
+              </w:rPr>
+              <w:t>5)</w:t>
             </w:r>
           </w:p>
         </w:tc>
@@ -1538,8 +1912,16 @@
               <w:rPr>
                 <w:sz w:val="18"/>
               </w:rPr>
-              <w:t>Employe_MD.NomCategorie</w:t>
-            </w:r>
+              <w:t>Employe_</w:t>
+            </w:r>
+            <w:proofErr w:type="gramStart"/>
+            <w:r>
+              <w:rPr>
+                <w:sz w:val="18"/>
+              </w:rPr>
+              <w:t>MD.NomCategorie</w:t>
+            </w:r>
+            <w:proofErr w:type="gramEnd"/>
           </w:p>
         </w:tc>
         <w:tc>
@@ -1592,8 +1974,16 @@
               <w:rPr>
                 <w:sz w:val="18"/>
               </w:rPr>
-              <w:t>Employe_MD.SuperCategorie</w:t>
-            </w:r>
+              <w:t>Employe_</w:t>
+            </w:r>
+            <w:proofErr w:type="gramStart"/>
+            <w:r>
+              <w:rPr>
+                <w:sz w:val="18"/>
+              </w:rPr>
+              <w:t>MD.SuperCategorie</w:t>
+            </w:r>
+            <w:proofErr w:type="gramEnd"/>
           </w:p>
         </w:tc>
         <w:tc>
@@ -1646,8 +2036,16 @@
               <w:rPr>
                 <w:sz w:val="18"/>
               </w:rPr>
-              <w:t>Employe_MD.CodeService</w:t>
-            </w:r>
+              <w:t>Employe_</w:t>
+            </w:r>
+            <w:proofErr w:type="gramStart"/>
+            <w:r>
+              <w:rPr>
+                <w:sz w:val="18"/>
+              </w:rPr>
+              <w:t>MD.CodeService</w:t>
+            </w:r>
+            <w:proofErr w:type="gramEnd"/>
           </w:p>
         </w:tc>
         <w:tc>
@@ -1668,11 +2066,19 @@
             <w:tcW w:w="1474" w:type="dxa"/>
           </w:tcPr>
           <w:p>
-            <w:r>
-              <w:rPr>
-                <w:sz w:val="18"/>
-              </w:rPr>
-              <w:t>NUMBER(10)</w:t>
+            <w:proofErr w:type="gramStart"/>
+            <w:r>
+              <w:rPr>
+                <w:sz w:val="18"/>
+              </w:rPr>
+              <w:t>NUMBER(</w:t>
+            </w:r>
+            <w:proofErr w:type="gramEnd"/>
+            <w:r>
+              <w:rPr>
+                <w:sz w:val="18"/>
+              </w:rPr>
+              <w:t>10)</w:t>
             </w:r>
           </w:p>
         </w:tc>
@@ -1700,8 +2106,16 @@
               <w:rPr>
                 <w:sz w:val="18"/>
               </w:rPr>
-              <w:t>Employe_MD.NomService</w:t>
-            </w:r>
+              <w:t>Employe_</w:t>
+            </w:r>
+            <w:proofErr w:type="gramStart"/>
+            <w:r>
+              <w:rPr>
+                <w:sz w:val="18"/>
+              </w:rPr>
+              <w:t>MD.NomService</w:t>
+            </w:r>
+            <w:proofErr w:type="gramEnd"/>
           </w:p>
         </w:tc>
         <w:tc>
@@ -1754,8 +2168,16 @@
               <w:rPr>
                 <w:sz w:val="18"/>
               </w:rPr>
-              <w:t>Employe_MD.CodeSociete</w:t>
-            </w:r>
+              <w:t>Employe_</w:t>
+            </w:r>
+            <w:proofErr w:type="gramStart"/>
+            <w:r>
+              <w:rPr>
+                <w:sz w:val="18"/>
+              </w:rPr>
+              <w:t>MD.CodeSociete</w:t>
+            </w:r>
+            <w:proofErr w:type="gramEnd"/>
           </w:p>
         </w:tc>
         <w:tc>
@@ -1808,8 +2230,16 @@
               <w:rPr>
                 <w:sz w:val="18"/>
               </w:rPr>
-              <w:t>Employe_MD.NomSociete</w:t>
-            </w:r>
+              <w:t>Employe_</w:t>
+            </w:r>
+            <w:proofErr w:type="gramStart"/>
+            <w:r>
+              <w:rPr>
+                <w:sz w:val="18"/>
+              </w:rPr>
+              <w:t>MD.NomSociete</w:t>
+            </w:r>
+            <w:proofErr w:type="gramEnd"/>
           </w:p>
         </w:tc>
         <w:tc>
@@ -1862,8 +2292,16 @@
               <w:rPr>
                 <w:sz w:val="18"/>
               </w:rPr>
-              <w:t>Employe_MD.CodeTy</w:t>
-            </w:r>
+              <w:t>Employe_</w:t>
+            </w:r>
+            <w:proofErr w:type="gramStart"/>
+            <w:r>
+              <w:rPr>
+                <w:sz w:val="18"/>
+              </w:rPr>
+              <w:t>MD.CodeTy</w:t>
+            </w:r>
+            <w:proofErr w:type="gramEnd"/>
           </w:p>
         </w:tc>
         <w:tc>
@@ -1916,8 +2354,16 @@
               <w:rPr>
                 <w:sz w:val="18"/>
               </w:rPr>
-              <w:t>Employe_MD.LibelleTypeSoc</w:t>
-            </w:r>
+              <w:t>Employe_</w:t>
+            </w:r>
+            <w:proofErr w:type="gramStart"/>
+            <w:r>
+              <w:rPr>
+                <w:sz w:val="18"/>
+              </w:rPr>
+              <w:t>MD.LibelleTypeSoc</w:t>
+            </w:r>
+            <w:proofErr w:type="gramEnd"/>
           </w:p>
         </w:tc>
         <w:tc>
@@ -1970,8 +2416,16 @@
               <w:rPr>
                 <w:sz w:val="18"/>
               </w:rPr>
-              <w:t>Employe_MD.CodeVille</w:t>
-            </w:r>
+              <w:t>Employe_</w:t>
+            </w:r>
+            <w:proofErr w:type="gramStart"/>
+            <w:r>
+              <w:rPr>
+                <w:sz w:val="18"/>
+              </w:rPr>
+              <w:t>MD.CodeVille</w:t>
+            </w:r>
+            <w:proofErr w:type="gramEnd"/>
           </w:p>
         </w:tc>
         <w:tc>
@@ -1983,7 +2437,21 @@
               <w:rPr>
                 <w:sz w:val="18"/>
               </w:rPr>
-              <w:t>Code de la commune de la société (France) ; vide pour l'Allemagne. Zone de niveau COMMUNE.</w:t>
+              <w:t>Code de la commune de la société (France</w:t>
+            </w:r>
+            <w:proofErr w:type="gramStart"/>
+            <w:r>
+              <w:rPr>
+                <w:sz w:val="18"/>
+              </w:rPr>
+              <w:t>) ;</w:t>
+            </w:r>
+            <w:proofErr w:type="gramEnd"/>
+            <w:r>
+              <w:rPr>
+                <w:sz w:val="18"/>
+              </w:rPr>
+              <w:t xml:space="preserve"> vide pour l'Allemagne. Zone de niveau COMMUNE.</w:t>
             </w:r>
           </w:p>
         </w:tc>
@@ -2005,12 +2473,14 @@
             <w:tcW w:w="2381" w:type="dxa"/>
           </w:tcPr>
           <w:p>
-            <w:r>
-              <w:rPr>
-                <w:sz w:val="18"/>
-              </w:rPr>
-              <w:t>Zone_Geo.CodeZG où NiveauZG = 'COMMUNE'</w:t>
-            </w:r>
+            <w:proofErr w:type="spellStart"/>
+            <w:r>
+              <w:rPr>
+                <w:sz w:val="18"/>
+              </w:rPr>
+              <w:t>Zone_Geo.CodeZG</w:t>
+            </w:r>
+            <w:proofErr w:type="spellEnd"/>
           </w:p>
         </w:tc>
       </w:tr>
@@ -2024,8 +2494,16 @@
               <w:rPr>
                 <w:sz w:val="18"/>
               </w:rPr>
-              <w:t>Employe_MD.NomVille</w:t>
-            </w:r>
+              <w:t>Employe_</w:t>
+            </w:r>
+            <w:proofErr w:type="gramStart"/>
+            <w:r>
+              <w:rPr>
+                <w:sz w:val="18"/>
+              </w:rPr>
+              <w:t>MD.NomVille</w:t>
+            </w:r>
+            <w:proofErr w:type="gramEnd"/>
           </w:p>
         </w:tc>
         <w:tc>
@@ -2059,12 +2537,14 @@
             <w:tcW w:w="2381" w:type="dxa"/>
           </w:tcPr>
           <w:p>
-            <w:r>
-              <w:rPr>
-                <w:sz w:val="18"/>
-              </w:rPr>
-              <w:t>Zone_Geo.NomZG où NiveauZG = 'COMMUNE'</w:t>
-            </w:r>
+            <w:proofErr w:type="spellStart"/>
+            <w:r>
+              <w:rPr>
+                <w:sz w:val="18"/>
+              </w:rPr>
+              <w:t>Zone_Geo.NomZG</w:t>
+            </w:r>
+            <w:proofErr w:type="spellEnd"/>
           </w:p>
         </w:tc>
       </w:tr>
@@ -2078,8 +2558,16 @@
               <w:rPr>
                 <w:sz w:val="18"/>
               </w:rPr>
-              <w:t>Employe_MD.CodeDepartement</w:t>
-            </w:r>
+              <w:t>Employe_</w:t>
+            </w:r>
+            <w:proofErr w:type="gramStart"/>
+            <w:r>
+              <w:rPr>
+                <w:sz w:val="18"/>
+              </w:rPr>
+              <w:t>MD.CodeDepartement</w:t>
+            </w:r>
+            <w:proofErr w:type="gramEnd"/>
           </w:p>
         </w:tc>
         <w:tc>
@@ -2113,12 +2601,14 @@
             <w:tcW w:w="2381" w:type="dxa"/>
           </w:tcPr>
           <w:p>
-            <w:r>
-              <w:rPr>
-                <w:sz w:val="18"/>
-              </w:rPr>
-              <w:t>Zone_Geo.CodeZG où NiveauZG = 'DEPARTEMENT'</w:t>
-            </w:r>
+            <w:proofErr w:type="spellStart"/>
+            <w:r>
+              <w:rPr>
+                <w:sz w:val="18"/>
+              </w:rPr>
+              <w:t>Zone_Geo.CodeZG</w:t>
+            </w:r>
+            <w:proofErr w:type="spellEnd"/>
           </w:p>
         </w:tc>
       </w:tr>
@@ -2132,8 +2622,16 @@
               <w:rPr>
                 <w:sz w:val="18"/>
               </w:rPr>
-              <w:t>Employe_MD.NomDepartement</w:t>
-            </w:r>
+              <w:t>Employe_</w:t>
+            </w:r>
+            <w:proofErr w:type="gramStart"/>
+            <w:r>
+              <w:rPr>
+                <w:sz w:val="18"/>
+              </w:rPr>
+              <w:t>MD.NomDepartement</w:t>
+            </w:r>
+            <w:proofErr w:type="gramEnd"/>
           </w:p>
         </w:tc>
         <w:tc>
@@ -2167,12 +2665,14 @@
             <w:tcW w:w="2381" w:type="dxa"/>
           </w:tcPr>
           <w:p>
-            <w:r>
-              <w:rPr>
-                <w:sz w:val="18"/>
-              </w:rPr>
-              <w:t>Zone_Geo.NomZG où NiveauZG = 'DEPARTEMENT'</w:t>
-            </w:r>
+            <w:proofErr w:type="spellStart"/>
+            <w:r>
+              <w:rPr>
+                <w:sz w:val="18"/>
+              </w:rPr>
+              <w:t>Zone_Geo.NomZG</w:t>
+            </w:r>
+            <w:proofErr w:type="spellEnd"/>
           </w:p>
         </w:tc>
       </w:tr>
@@ -2186,8 +2686,16 @@
               <w:rPr>
                 <w:sz w:val="18"/>
               </w:rPr>
-              <w:t>Employe_MD.CodeGeminede</w:t>
-            </w:r>
+              <w:t>Employe_</w:t>
+            </w:r>
+            <w:proofErr w:type="gramStart"/>
+            <w:r>
+              <w:rPr>
+                <w:sz w:val="18"/>
+              </w:rPr>
+              <w:t>MD.CodeGemeinde</w:t>
+            </w:r>
+            <w:proofErr w:type="gramEnd"/>
           </w:p>
         </w:tc>
         <w:tc>
@@ -2199,7 +2707,21 @@
               <w:rPr>
                 <w:sz w:val="18"/>
               </w:rPr>
-              <w:t>Code de la Gemeinde de la société (Allemagne) ; vide pour la France. Zone de niveau GEMEINDE.</w:t>
+              <w:t>Code de la Gemeinde de la société (Allemagne</w:t>
+            </w:r>
+            <w:proofErr w:type="gramStart"/>
+            <w:r>
+              <w:rPr>
+                <w:sz w:val="18"/>
+              </w:rPr>
+              <w:t>) ;</w:t>
+            </w:r>
+            <w:proofErr w:type="gramEnd"/>
+            <w:r>
+              <w:rPr>
+                <w:sz w:val="18"/>
+              </w:rPr>
+              <w:t xml:space="preserve"> vide pour la France. Zone de niveau GEMEINDE.</w:t>
             </w:r>
           </w:p>
         </w:tc>
@@ -2221,12 +2743,14 @@
             <w:tcW w:w="2381" w:type="dxa"/>
           </w:tcPr>
           <w:p>
-            <w:r>
-              <w:rPr>
-                <w:sz w:val="18"/>
-              </w:rPr>
-              <w:t>Zone_Geo.CodeZG où NiveauZG = 'GEMEINDE'</w:t>
-            </w:r>
+            <w:proofErr w:type="spellStart"/>
+            <w:r>
+              <w:rPr>
+                <w:sz w:val="18"/>
+              </w:rPr>
+              <w:t>Zone_Geo.CodeZG</w:t>
+            </w:r>
+            <w:proofErr w:type="spellEnd"/>
           </w:p>
         </w:tc>
       </w:tr>
@@ -2240,8 +2764,16 @@
               <w:rPr>
                 <w:sz w:val="18"/>
               </w:rPr>
-              <w:t>Employe_MD.NomGemiende</w:t>
-            </w:r>
+              <w:t>Employe_</w:t>
+            </w:r>
+            <w:proofErr w:type="gramStart"/>
+            <w:r>
+              <w:rPr>
+                <w:sz w:val="18"/>
+              </w:rPr>
+              <w:t>MD.NomGemeinde</w:t>
+            </w:r>
+            <w:proofErr w:type="gramEnd"/>
           </w:p>
         </w:tc>
         <w:tc>
@@ -2275,12 +2807,14 @@
             <w:tcW w:w="2381" w:type="dxa"/>
           </w:tcPr>
           <w:p>
-            <w:r>
-              <w:rPr>
-                <w:sz w:val="18"/>
-              </w:rPr>
-              <w:t>Zone_Geo.NomZG où NiveauZG = 'GEMEINDE'</w:t>
-            </w:r>
+            <w:proofErr w:type="spellStart"/>
+            <w:r>
+              <w:rPr>
+                <w:sz w:val="18"/>
+              </w:rPr>
+              <w:t>Zone_Geo.NomZG</w:t>
+            </w:r>
+            <w:proofErr w:type="spellEnd"/>
           </w:p>
         </w:tc>
       </w:tr>
@@ -2294,8 +2828,16 @@
               <w:rPr>
                 <w:sz w:val="18"/>
               </w:rPr>
-              <w:t>Employe_MD.CodeKreis</w:t>
-            </w:r>
+              <w:t>Employe_</w:t>
+            </w:r>
+            <w:proofErr w:type="gramStart"/>
+            <w:r>
+              <w:rPr>
+                <w:sz w:val="18"/>
+              </w:rPr>
+              <w:t>MD.CodeKreis</w:t>
+            </w:r>
+            <w:proofErr w:type="gramEnd"/>
           </w:p>
         </w:tc>
         <w:tc>
@@ -2307,7 +2849,7 @@
               <w:rPr>
                 <w:sz w:val="18"/>
               </w:rPr>
-              <w:t>Code du Kreis (Allemagne). Zone de niveau KREIS.</w:t>
+              <w:t>Code du Kreis (Allemagne). Zone de niveau LANDKREIS ou KREISFREIE STADT.</w:t>
             </w:r>
           </w:p>
         </w:tc>
@@ -2329,12 +2871,14 @@
             <w:tcW w:w="2381" w:type="dxa"/>
           </w:tcPr>
           <w:p>
-            <w:r>
-              <w:rPr>
-                <w:sz w:val="18"/>
-              </w:rPr>
-              <w:t>Zone_Geo.CodeZG où NiveauZG = 'KREIS'</w:t>
-            </w:r>
+            <w:proofErr w:type="spellStart"/>
+            <w:r>
+              <w:rPr>
+                <w:sz w:val="18"/>
+              </w:rPr>
+              <w:t>Zone_Geo.CodeZG</w:t>
+            </w:r>
+            <w:proofErr w:type="spellEnd"/>
           </w:p>
         </w:tc>
       </w:tr>
@@ -2348,8 +2892,16 @@
               <w:rPr>
                 <w:sz w:val="18"/>
               </w:rPr>
-              <w:t>Employe_MD.NomKreis</w:t>
-            </w:r>
+              <w:t>Employe_</w:t>
+            </w:r>
+            <w:proofErr w:type="gramStart"/>
+            <w:r>
+              <w:rPr>
+                <w:sz w:val="18"/>
+              </w:rPr>
+              <w:t>MD.NomKreis</w:t>
+            </w:r>
+            <w:proofErr w:type="gramEnd"/>
           </w:p>
         </w:tc>
         <w:tc>
@@ -2383,19 +2935,14 @@
             <w:tcW w:w="2381" w:type="dxa"/>
           </w:tcPr>
           <w:p>
-            <w:r>
-              <w:rPr>
-                <w:sz w:val="18"/>
-              </w:rPr>
-              <w:t xml:space="preserve">Zone_Geo.NomZG où </w:t>
-            </w:r>
-            <w:r>
-              <w:rPr>
-                <w:sz w:val="18"/>
-              </w:rPr>
-              <w:lastRenderedPageBreak/>
-              <w:t>NiveauZG = 'KREIS'</w:t>
-            </w:r>
+            <w:proofErr w:type="spellStart"/>
+            <w:r>
+              <w:rPr>
+                <w:sz w:val="18"/>
+              </w:rPr>
+              <w:t>Zone_Geo.NomZG</w:t>
+            </w:r>
+            <w:proofErr w:type="spellEnd"/>
           </w:p>
         </w:tc>
       </w:tr>
@@ -2409,9 +2956,16 @@
               <w:rPr>
                 <w:sz w:val="18"/>
               </w:rPr>
-              <w:lastRenderedPageBreak/>
-              <w:t>Employe_MD.CodeDistrict</w:t>
-            </w:r>
+              <w:t>Employe_</w:t>
+            </w:r>
+            <w:proofErr w:type="gramStart"/>
+            <w:r>
+              <w:rPr>
+                <w:sz w:val="18"/>
+              </w:rPr>
+              <w:t>MD.TypeKreis</w:t>
+            </w:r>
+            <w:proofErr w:type="gramEnd"/>
           </w:p>
         </w:tc>
         <w:tc>
@@ -2423,7 +2977,89 @@
               <w:rPr>
                 <w:sz w:val="18"/>
               </w:rPr>
-              <w:t>Code du district (Regierungsbezirk) ; vide si le Kreis dépend directement d'un Land. Zone de niveau DISTRICT.</w:t>
+              <w:t>Type du Kreis (</w:t>
+            </w:r>
+            <w:r>
+              <w:rPr>
+                <w:sz w:val="18"/>
+              </w:rPr>
+              <w:t xml:space="preserve">‘Landkreis’ </w:t>
+            </w:r>
+            <w:proofErr w:type="spellStart"/>
+            <w:r>
+              <w:rPr>
+                <w:sz w:val="18"/>
+              </w:rPr>
+              <w:t>ou</w:t>
+            </w:r>
+            <w:proofErr w:type="spellEnd"/>
+            <w:r>
+              <w:rPr>
+                <w:sz w:val="18"/>
+              </w:rPr>
+              <w:t xml:space="preserve"> ‘</w:t>
+            </w:r>
+            <w:proofErr w:type="spellStart"/>
+            <w:r>
+              <w:rPr>
+                <w:sz w:val="18"/>
+              </w:rPr>
+              <w:t>Kreisfreie</w:t>
+            </w:r>
+            <w:proofErr w:type="spellEnd"/>
+            <w:r>
+              <w:rPr>
+                <w:sz w:val="18"/>
+              </w:rPr>
+              <w:t xml:space="preserve"> Stadt’</w:t>
+            </w:r>
+            <w:r>
+              <w:rPr>
+                <w:sz w:val="18"/>
+              </w:rPr>
+              <w:t xml:space="preserve">), </w:t>
+            </w:r>
+            <w:proofErr w:type="spellStart"/>
+            <w:r>
+              <w:rPr>
+                <w:sz w:val="18"/>
+              </w:rPr>
+              <w:t>selon</w:t>
+            </w:r>
+            <w:proofErr w:type="spellEnd"/>
+            <w:r>
+              <w:rPr>
+                <w:sz w:val="18"/>
+              </w:rPr>
+              <w:t xml:space="preserve"> le </w:t>
+            </w:r>
+            <w:proofErr w:type="spellStart"/>
+            <w:r>
+              <w:rPr>
+                <w:sz w:val="18"/>
+              </w:rPr>
+              <w:t>fichier</w:t>
+            </w:r>
+            <w:proofErr w:type="spellEnd"/>
+            <w:r>
+              <w:rPr>
+                <w:sz w:val="18"/>
+              </w:rPr>
+              <w:t xml:space="preserve"> </w:t>
+            </w:r>
+            <w:proofErr w:type="gramStart"/>
+            <w:r>
+              <w:rPr>
+                <w:sz w:val="18"/>
+              </w:rPr>
+              <w:t>source ;</w:t>
+            </w:r>
+            <w:proofErr w:type="gramEnd"/>
+            <w:r>
+              <w:rPr>
+                <w:sz w:val="18"/>
+              </w:rPr>
+              <w:t xml:space="preserve"> vide pour la France.</w:t>
             </w:r>
           </w:p>
         </w:tc>
@@ -2436,7 +3072,7 @@
               <w:rPr>
                 <w:sz w:val="18"/>
               </w:rPr>
-              <w:t>VARCHAR2(10)</w:t>
+              <w:t>VARCHAR2(20)</w:t>
             </w:r>
           </w:p>
         </w:tc>
@@ -2445,12 +3081,14 @@
             <w:tcW w:w="2381" w:type="dxa"/>
           </w:tcPr>
           <w:p>
-            <w:r>
-              <w:rPr>
-                <w:sz w:val="18"/>
-              </w:rPr>
-              <w:t>Zone_Geo.CodeZG où NiveauZG = 'DISTRICT'</w:t>
-            </w:r>
+            <w:proofErr w:type="spellStart"/>
+            <w:r>
+              <w:rPr>
+                <w:sz w:val="18"/>
+              </w:rPr>
+              <w:t>Zone_Geo.NiveauZG</w:t>
+            </w:r>
+            <w:proofErr w:type="spellEnd"/>
           </w:p>
         </w:tc>
       </w:tr>
@@ -2464,8 +3102,17 @@
               <w:rPr>
                 <w:sz w:val="18"/>
               </w:rPr>
-              <w:t>Employe_MD.NomDistrict</w:t>
-            </w:r>
+              <w:lastRenderedPageBreak/>
+              <w:t>Employe_</w:t>
+            </w:r>
+            <w:proofErr w:type="gramStart"/>
+            <w:r>
+              <w:rPr>
+                <w:sz w:val="18"/>
+              </w:rPr>
+              <w:t>MD.CodeDistrict</w:t>
+            </w:r>
+            <w:proofErr w:type="gramEnd"/>
           </w:p>
         </w:tc>
         <w:tc>
@@ -2477,7 +3124,21 @@
               <w:rPr>
                 <w:sz w:val="18"/>
               </w:rPr>
-              <w:t>Nom du district</w:t>
+              <w:t>Code du district (Regierungsbezirk</w:t>
+            </w:r>
+            <w:proofErr w:type="gramStart"/>
+            <w:r>
+              <w:rPr>
+                <w:sz w:val="18"/>
+              </w:rPr>
+              <w:t>) ;</w:t>
+            </w:r>
+            <w:proofErr w:type="gramEnd"/>
+            <w:r>
+              <w:rPr>
+                <w:sz w:val="18"/>
+              </w:rPr>
+              <w:t xml:space="preserve"> vide si le Kreis dépend directement d'un Land. Zone de niveau DISTRICT.</w:t>
             </w:r>
           </w:p>
         </w:tc>
@@ -2490,7 +3151,7 @@
               <w:rPr>
                 <w:sz w:val="18"/>
               </w:rPr>
-              <w:t>VARCHAR2(100)</w:t>
+              <w:t>VARCHAR2(10)</w:t>
             </w:r>
           </w:p>
         </w:tc>
@@ -2499,12 +3160,14 @@
             <w:tcW w:w="2381" w:type="dxa"/>
           </w:tcPr>
           <w:p>
-            <w:r>
-              <w:rPr>
-                <w:sz w:val="18"/>
-              </w:rPr>
-              <w:t>Zone_Geo.NomZG où NiveauZG = 'DISTRICT'</w:t>
-            </w:r>
+            <w:proofErr w:type="spellStart"/>
+            <w:r>
+              <w:rPr>
+                <w:sz w:val="18"/>
+              </w:rPr>
+              <w:t>Zone_Geo.CodeZG</w:t>
+            </w:r>
+            <w:proofErr w:type="spellEnd"/>
           </w:p>
         </w:tc>
       </w:tr>
@@ -2518,8 +3181,16 @@
               <w:rPr>
                 <w:sz w:val="18"/>
               </w:rPr>
-              <w:t>Employe_MD.CodeRegion</w:t>
-            </w:r>
+              <w:t>Employe_</w:t>
+            </w:r>
+            <w:proofErr w:type="gramStart"/>
+            <w:r>
+              <w:rPr>
+                <w:sz w:val="18"/>
+              </w:rPr>
+              <w:t>MD.NomDistrict</w:t>
+            </w:r>
+            <w:proofErr w:type="gramEnd"/>
           </w:p>
         </w:tc>
         <w:tc>
@@ -2531,7 +3202,7 @@
               <w:rPr>
                 <w:sz w:val="18"/>
               </w:rPr>
-              <w:t>Code de la région (France) ou du Land (Allemagne). Zone de niveau REGION ou LAND.</w:t>
+              <w:t>Nom du district</w:t>
             </w:r>
           </w:p>
         </w:tc>
@@ -2544,7 +3215,7 @@
               <w:rPr>
                 <w:sz w:val="18"/>
               </w:rPr>
-              <w:t>VARCHAR2(10)</w:t>
+              <w:t>VARCHAR2(100)</w:t>
             </w:r>
           </w:p>
         </w:tc>
@@ -2553,12 +3224,14 @@
             <w:tcW w:w="2381" w:type="dxa"/>
           </w:tcPr>
           <w:p>
-            <w:r>
-              <w:rPr>
-                <w:sz w:val="18"/>
-              </w:rPr>
-              <w:t>COALESCE(Zone_Geo.CodeZG où NiveauZG = 'REGION', Zone_Geo.CodeZG où NiveauZG = 'LAND')</w:t>
-            </w:r>
+            <w:proofErr w:type="spellStart"/>
+            <w:r>
+              <w:rPr>
+                <w:sz w:val="18"/>
+              </w:rPr>
+              <w:t>Zone_Geo.NomZG</w:t>
+            </w:r>
+            <w:proofErr w:type="spellEnd"/>
           </w:p>
         </w:tc>
       </w:tr>
@@ -2572,8 +3245,16 @@
               <w:rPr>
                 <w:sz w:val="18"/>
               </w:rPr>
-              <w:t>Employe_MD.NomRegion</w:t>
-            </w:r>
+              <w:t>Employe_</w:t>
+            </w:r>
+            <w:proofErr w:type="gramStart"/>
+            <w:r>
+              <w:rPr>
+                <w:sz w:val="18"/>
+              </w:rPr>
+              <w:t>MD.CodeRegion</w:t>
+            </w:r>
+            <w:proofErr w:type="gramEnd"/>
           </w:p>
         </w:tc>
         <w:tc>
@@ -2585,7 +3266,21 @@
               <w:rPr>
                 <w:sz w:val="18"/>
               </w:rPr>
-              <w:t>Nom de la région ou du Land</w:t>
+              <w:t>Code de la région (France</w:t>
+            </w:r>
+            <w:proofErr w:type="gramStart"/>
+            <w:r>
+              <w:rPr>
+                <w:sz w:val="18"/>
+              </w:rPr>
+              <w:t>) ;</w:t>
+            </w:r>
+            <w:proofErr w:type="gramEnd"/>
+            <w:r>
+              <w:rPr>
+                <w:sz w:val="18"/>
+              </w:rPr>
+              <w:t xml:space="preserve"> vide pour l'Allemagne. Zone de niveau REGION.</w:t>
             </w:r>
           </w:p>
         </w:tc>
@@ -2598,7 +3293,7 @@
               <w:rPr>
                 <w:sz w:val="18"/>
               </w:rPr>
-              <w:t>VARCHAR2(100)</w:t>
+              <w:t>VARCHAR2(10)</w:t>
             </w:r>
           </w:p>
         </w:tc>
@@ -2607,12 +3302,14 @@
             <w:tcW w:w="2381" w:type="dxa"/>
           </w:tcPr>
           <w:p>
-            <w:r>
-              <w:rPr>
-                <w:sz w:val="18"/>
-              </w:rPr>
-              <w:t>COALESCE(Zone_Geo.NomZG où NiveauZG = 'REGION', Zone_Geo.NomZG où NiveauZG = 'LAND')</w:t>
-            </w:r>
+            <w:proofErr w:type="spellStart"/>
+            <w:r>
+              <w:rPr>
+                <w:sz w:val="18"/>
+              </w:rPr>
+              <w:t>Zone_Geo.CodeZG</w:t>
+            </w:r>
+            <w:proofErr w:type="spellEnd"/>
           </w:p>
         </w:tc>
       </w:tr>
@@ -2626,8 +3323,16 @@
               <w:rPr>
                 <w:sz w:val="18"/>
               </w:rPr>
-              <w:t>Employe_MD.CodePays</w:t>
-            </w:r>
+              <w:t>Employe_</w:t>
+            </w:r>
+            <w:proofErr w:type="gramStart"/>
+            <w:r>
+              <w:rPr>
+                <w:sz w:val="18"/>
+              </w:rPr>
+              <w:t>MD.NomRegion</w:t>
+            </w:r>
+            <w:proofErr w:type="gramEnd"/>
           </w:p>
         </w:tc>
         <w:tc>
@@ -2639,7 +3344,7 @@
               <w:rPr>
                 <w:sz w:val="18"/>
               </w:rPr>
-              <w:t>Code du pays (FR, DE)</w:t>
+              <w:t>Nom de la région (France)</w:t>
             </w:r>
           </w:p>
         </w:tc>
@@ -2652,7 +3357,7 @@
               <w:rPr>
                 <w:sz w:val="18"/>
               </w:rPr>
-              <w:t>CHAR(2)</w:t>
+              <w:t>VARCHAR2(100)</w:t>
             </w:r>
           </w:p>
         </w:tc>
@@ -2661,12 +3366,14 @@
             <w:tcW w:w="2381" w:type="dxa"/>
           </w:tcPr>
           <w:p>
-            <w:r>
-              <w:rPr>
-                <w:sz w:val="18"/>
-              </w:rPr>
-              <w:t>Zone_Geo.CodePays</w:t>
-            </w:r>
+            <w:proofErr w:type="spellStart"/>
+            <w:r>
+              <w:rPr>
+                <w:sz w:val="18"/>
+              </w:rPr>
+              <w:t>Zone_Geo.NomZG</w:t>
+            </w:r>
+            <w:proofErr w:type="spellEnd"/>
           </w:p>
         </w:tc>
       </w:tr>
@@ -2680,8 +3387,16 @@
               <w:rPr>
                 <w:sz w:val="18"/>
               </w:rPr>
-              <w:t>Employe_MD.NomPays</w:t>
-            </w:r>
+              <w:t>Employe_</w:t>
+            </w:r>
+            <w:proofErr w:type="gramStart"/>
+            <w:r>
+              <w:rPr>
+                <w:sz w:val="18"/>
+              </w:rPr>
+              <w:t>MD.CodeLand</w:t>
+            </w:r>
+            <w:proofErr w:type="gramEnd"/>
           </w:p>
         </w:tc>
         <w:tc>
@@ -2693,7 +3408,21 @@
               <w:rPr>
                 <w:sz w:val="18"/>
               </w:rPr>
-              <w:t>Nom du pays</w:t>
+              <w:t>Code du Land (Allemagne</w:t>
+            </w:r>
+            <w:proofErr w:type="gramStart"/>
+            <w:r>
+              <w:rPr>
+                <w:sz w:val="18"/>
+              </w:rPr>
+              <w:t>) ;</w:t>
+            </w:r>
+            <w:proofErr w:type="gramEnd"/>
+            <w:r>
+              <w:rPr>
+                <w:sz w:val="18"/>
+              </w:rPr>
+              <w:t xml:space="preserve"> vide pour la France. Zone de niveau LAND (les villes-États Berlin, Hamburg, Bremen sont des Länder).</w:t>
             </w:r>
           </w:p>
         </w:tc>
@@ -2706,7 +3435,7 @@
               <w:rPr>
                 <w:sz w:val="18"/>
               </w:rPr>
-              <w:t>VARCHAR2(50)</w:t>
+              <w:t>VARCHAR2(10)</w:t>
             </w:r>
           </w:p>
         </w:tc>
@@ -2715,12 +3444,14 @@
             <w:tcW w:w="2381" w:type="dxa"/>
           </w:tcPr>
           <w:p>
-            <w:r>
-              <w:rPr>
-                <w:sz w:val="18"/>
-              </w:rPr>
-              <w:t>Pays.NomPays</w:t>
-            </w:r>
+            <w:proofErr w:type="spellStart"/>
+            <w:r>
+              <w:rPr>
+                <w:sz w:val="18"/>
+              </w:rPr>
+              <w:t>Zone_Geo.CodeZG</w:t>
+            </w:r>
+            <w:proofErr w:type="spellEnd"/>
           </w:p>
         </w:tc>
       </w:tr>
@@ -2734,8 +3465,16 @@
               <w:rPr>
                 <w:sz w:val="18"/>
               </w:rPr>
-              <w:t>Employe_MD.TauxTVA</w:t>
-            </w:r>
+              <w:t>Employe_</w:t>
+            </w:r>
+            <w:proofErr w:type="gramStart"/>
+            <w:r>
+              <w:rPr>
+                <w:sz w:val="18"/>
+              </w:rPr>
+              <w:t>MD.NomLand</w:t>
+            </w:r>
+            <w:proofErr w:type="gramEnd"/>
           </w:p>
         </w:tc>
         <w:tc>
@@ -2747,6 +3486,308 @@
               <w:rPr>
                 <w:sz w:val="18"/>
               </w:rPr>
+              <w:t>Nom du Land</w:t>
+            </w:r>
+          </w:p>
+        </w:tc>
+        <w:tc>
+          <w:tcPr>
+            <w:tcW w:w="1474" w:type="dxa"/>
+          </w:tcPr>
+          <w:p>
+            <w:r>
+              <w:rPr>
+                <w:sz w:val="18"/>
+              </w:rPr>
+              <w:t>VARCHAR2(100)</w:t>
+            </w:r>
+          </w:p>
+        </w:tc>
+        <w:tc>
+          <w:tcPr>
+            <w:tcW w:w="2381" w:type="dxa"/>
+          </w:tcPr>
+          <w:p>
+            <w:proofErr w:type="spellStart"/>
+            <w:r>
+              <w:rPr>
+                <w:sz w:val="18"/>
+              </w:rPr>
+              <w:t>Zone_Geo.NomZG</w:t>
+            </w:r>
+            <w:proofErr w:type="spellEnd"/>
+          </w:p>
+        </w:tc>
+      </w:tr>
+      <w:tr>
+        <w:tc>
+          <w:tcPr>
+            <w:tcW w:w="2608" w:type="dxa"/>
+          </w:tcPr>
+          <w:p>
+            <w:r>
+              <w:rPr>
+                <w:sz w:val="18"/>
+              </w:rPr>
+              <w:t>Employe_</w:t>
+            </w:r>
+            <w:proofErr w:type="gramStart"/>
+            <w:r>
+              <w:rPr>
+                <w:sz w:val="18"/>
+              </w:rPr>
+              <w:t>MD.TypeLand</w:t>
+            </w:r>
+            <w:proofErr w:type="gramEnd"/>
+          </w:p>
+        </w:tc>
+        <w:tc>
+          <w:tcPr>
+            <w:tcW w:w="3628" w:type="dxa"/>
+          </w:tcPr>
+          <w:p>
+            <w:r>
+              <w:rPr>
+                <w:sz w:val="18"/>
+              </w:rPr>
+              <w:t xml:space="preserve">Type du </w:t>
+            </w:r>
+            <w:proofErr w:type="gramStart"/>
+            <w:r>
+              <w:rPr>
+                <w:sz w:val="18"/>
+              </w:rPr>
+              <w:t>Land :</w:t>
+            </w:r>
+            <w:proofErr w:type="gramEnd"/>
+            <w:r>
+              <w:rPr>
+                <w:sz w:val="18"/>
+              </w:rPr>
+              <w:t xml:space="preserve"> 'Stadtstaat' (ville-</w:t>
+            </w:r>
+            <w:proofErr w:type="gramStart"/>
+            <w:r>
+              <w:rPr>
+                <w:sz w:val="18"/>
+              </w:rPr>
+              <w:t>État :</w:t>
+            </w:r>
+            <w:proofErr w:type="gramEnd"/>
+            <w:r>
+              <w:rPr>
+                <w:sz w:val="18"/>
+              </w:rPr>
+              <w:t xml:space="preserve"> Berlin, Hamburg, Bremen) ou 'Flächenland' (Land territorial</w:t>
+            </w:r>
+            <w:proofErr w:type="gramStart"/>
+            <w:r>
+              <w:rPr>
+                <w:sz w:val="18"/>
+              </w:rPr>
+              <w:t>) ;</w:t>
+            </w:r>
+            <w:proofErr w:type="gramEnd"/>
+            <w:r>
+              <w:rPr>
+                <w:sz w:val="18"/>
+              </w:rPr>
+              <w:t xml:space="preserve"> vide pour la France.</w:t>
+            </w:r>
+          </w:p>
+        </w:tc>
+        <w:tc>
+          <w:tcPr>
+            <w:tcW w:w="1474" w:type="dxa"/>
+          </w:tcPr>
+          <w:p>
+            <w:r>
+              <w:rPr>
+                <w:sz w:val="18"/>
+              </w:rPr>
+              <w:t>VARCHAR2(12)</w:t>
+            </w:r>
+          </w:p>
+        </w:tc>
+        <w:tc>
+          <w:tcPr>
+            <w:tcW w:w="2381" w:type="dxa"/>
+          </w:tcPr>
+          <w:p>
+            <w:proofErr w:type="spellStart"/>
+            <w:r>
+              <w:rPr>
+                <w:sz w:val="18"/>
+              </w:rPr>
+              <w:t>Zone_Geo.CodeZG</w:t>
+            </w:r>
+            <w:proofErr w:type="spellEnd"/>
+          </w:p>
+        </w:tc>
+      </w:tr>
+      <w:tr>
+        <w:tc>
+          <w:tcPr>
+            <w:tcW w:w="2608" w:type="dxa"/>
+          </w:tcPr>
+          <w:p>
+            <w:r>
+              <w:rPr>
+                <w:sz w:val="18"/>
+              </w:rPr>
+              <w:t>Employe_</w:t>
+            </w:r>
+            <w:proofErr w:type="gramStart"/>
+            <w:r>
+              <w:rPr>
+                <w:sz w:val="18"/>
+              </w:rPr>
+              <w:t>MD.CodePays</w:t>
+            </w:r>
+            <w:proofErr w:type="gramEnd"/>
+          </w:p>
+        </w:tc>
+        <w:tc>
+          <w:tcPr>
+            <w:tcW w:w="3628" w:type="dxa"/>
+          </w:tcPr>
+          <w:p>
+            <w:r>
+              <w:rPr>
+                <w:sz w:val="18"/>
+              </w:rPr>
+              <w:t>Code du pays (FR, DE)</w:t>
+            </w:r>
+          </w:p>
+        </w:tc>
+        <w:tc>
+          <w:tcPr>
+            <w:tcW w:w="1474" w:type="dxa"/>
+          </w:tcPr>
+          <w:p>
+            <w:proofErr w:type="gramStart"/>
+            <w:r>
+              <w:rPr>
+                <w:sz w:val="18"/>
+              </w:rPr>
+              <w:t>CHAR(</w:t>
+            </w:r>
+            <w:proofErr w:type="gramEnd"/>
+            <w:r>
+              <w:rPr>
+                <w:sz w:val="18"/>
+              </w:rPr>
+              <w:t>2)</w:t>
+            </w:r>
+          </w:p>
+        </w:tc>
+        <w:tc>
+          <w:tcPr>
+            <w:tcW w:w="2381" w:type="dxa"/>
+          </w:tcPr>
+          <w:p>
+            <w:r>
+              <w:rPr>
+                <w:sz w:val="18"/>
+              </w:rPr>
+              <w:t>Zone_Geo.CodePays</w:t>
+            </w:r>
+          </w:p>
+        </w:tc>
+      </w:tr>
+      <w:tr>
+        <w:tc>
+          <w:tcPr>
+            <w:tcW w:w="2608" w:type="dxa"/>
+          </w:tcPr>
+          <w:p>
+            <w:r>
+              <w:rPr>
+                <w:sz w:val="18"/>
+              </w:rPr>
+              <w:t>Employe_</w:t>
+            </w:r>
+            <w:proofErr w:type="gramStart"/>
+            <w:r>
+              <w:rPr>
+                <w:sz w:val="18"/>
+              </w:rPr>
+              <w:t>MD.NomPays</w:t>
+            </w:r>
+            <w:proofErr w:type="gramEnd"/>
+          </w:p>
+        </w:tc>
+        <w:tc>
+          <w:tcPr>
+            <w:tcW w:w="3628" w:type="dxa"/>
+          </w:tcPr>
+          <w:p>
+            <w:r>
+              <w:rPr>
+                <w:sz w:val="18"/>
+              </w:rPr>
+              <w:t>Nom du pays</w:t>
+            </w:r>
+          </w:p>
+        </w:tc>
+        <w:tc>
+          <w:tcPr>
+            <w:tcW w:w="1474" w:type="dxa"/>
+          </w:tcPr>
+          <w:p>
+            <w:r>
+              <w:rPr>
+                <w:sz w:val="18"/>
+              </w:rPr>
+              <w:t>VARCHAR2(50)</w:t>
+            </w:r>
+          </w:p>
+        </w:tc>
+        <w:tc>
+          <w:tcPr>
+            <w:tcW w:w="2381" w:type="dxa"/>
+          </w:tcPr>
+          <w:p>
+            <w:r>
+              <w:rPr>
+                <w:sz w:val="18"/>
+              </w:rPr>
+              <w:t>Pays.NomPays</w:t>
+            </w:r>
+          </w:p>
+        </w:tc>
+      </w:tr>
+      <w:tr>
+        <w:tc>
+          <w:tcPr>
+            <w:tcW w:w="2608" w:type="dxa"/>
+          </w:tcPr>
+          <w:p>
+            <w:r>
+              <w:rPr>
+                <w:sz w:val="18"/>
+              </w:rPr>
+              <w:t>Employe_</w:t>
+            </w:r>
+            <w:proofErr w:type="gramStart"/>
+            <w:r>
+              <w:rPr>
+                <w:sz w:val="18"/>
+              </w:rPr>
+              <w:t>MD.TauxTVA</w:t>
+            </w:r>
+            <w:proofErr w:type="gramEnd"/>
+          </w:p>
+        </w:tc>
+        <w:tc>
+          <w:tcPr>
+            <w:tcW w:w="3628" w:type="dxa"/>
+          </w:tcPr>
+          <w:p>
+            <w:r>
+              <w:rPr>
+                <w:sz w:val="18"/>
+              </w:rPr>
               <w:t>Taux normal de TVA du pays</w:t>
             </w:r>
           </w:p>
@@ -2756,11 +3797,19 @@
             <w:tcW w:w="1474" w:type="dxa"/>
           </w:tcPr>
           <w:p>
-            <w:r>
-              <w:rPr>
-                <w:sz w:val="18"/>
-              </w:rPr>
-              <w:t>NUMBER(4,3)</w:t>
+            <w:proofErr w:type="gramStart"/>
+            <w:r>
+              <w:rPr>
+                <w:sz w:val="18"/>
+              </w:rPr>
+              <w:t>NUMBER(</w:t>
+            </w:r>
+            <w:proofErr w:type="gramEnd"/>
+            <w:r>
+              <w:rPr>
+                <w:sz w:val="18"/>
+              </w:rPr>
+              <w:t>4,3)</w:t>
             </w:r>
           </w:p>
         </w:tc>
@@ -2876,8 +3925,16 @@
               <w:rPr>
                 <w:sz w:val="18"/>
               </w:rPr>
-              <w:t>Exemplaire_MD.CodeExemplaire</w:t>
-            </w:r>
+              <w:t>Exemplaire_</w:t>
+            </w:r>
+            <w:proofErr w:type="gramStart"/>
+            <w:r>
+              <w:rPr>
+                <w:sz w:val="18"/>
+              </w:rPr>
+              <w:t>MD.CodeExemplaire</w:t>
+            </w:r>
+            <w:proofErr w:type="gramEnd"/>
           </w:p>
         </w:tc>
         <w:tc>
@@ -2898,11 +3955,19 @@
             <w:tcW w:w="1474" w:type="dxa"/>
           </w:tcPr>
           <w:p>
-            <w:r>
-              <w:rPr>
-                <w:sz w:val="18"/>
-              </w:rPr>
-              <w:t>NUMBER(10)</w:t>
+            <w:proofErr w:type="gramStart"/>
+            <w:r>
+              <w:rPr>
+                <w:sz w:val="18"/>
+              </w:rPr>
+              <w:t>NUMBER(</w:t>
+            </w:r>
+            <w:proofErr w:type="gramEnd"/>
+            <w:r>
+              <w:rPr>
+                <w:sz w:val="18"/>
+              </w:rPr>
+              <w:t>10)</w:t>
             </w:r>
           </w:p>
         </w:tc>
@@ -2930,8 +3995,16 @@
               <w:rPr>
                 <w:sz w:val="18"/>
               </w:rPr>
-              <w:t>Exemplaire_MD.NumeroSerieEXemplaire</w:t>
-            </w:r>
+              <w:t>Exemplaire_</w:t>
+            </w:r>
+            <w:proofErr w:type="gramStart"/>
+            <w:r>
+              <w:rPr>
+                <w:sz w:val="18"/>
+              </w:rPr>
+              <w:t>MD.NumeroSerieEXemplaire</w:t>
+            </w:r>
+            <w:proofErr w:type="gramEnd"/>
           </w:p>
         </w:tc>
         <w:tc>
@@ -2984,8 +4057,16 @@
               <w:rPr>
                 <w:sz w:val="18"/>
               </w:rPr>
-              <w:t>Exemplaire_MD.DateMiseServiceEXemplaire</w:t>
-            </w:r>
+              <w:t>Exemplaire_</w:t>
+            </w:r>
+            <w:proofErr w:type="gramStart"/>
+            <w:r>
+              <w:rPr>
+                <w:sz w:val="18"/>
+              </w:rPr>
+              <w:t>MD.DateMiseServiceEXemplaire</w:t>
+            </w:r>
+            <w:proofErr w:type="gramEnd"/>
           </w:p>
         </w:tc>
         <w:tc>
@@ -3038,8 +4119,16 @@
               <w:rPr>
                 <w:sz w:val="18"/>
               </w:rPr>
-              <w:t>Exemplaire_MD.DateReformeEXemplaire</w:t>
-            </w:r>
+              <w:t>Exemplaire_</w:t>
+            </w:r>
+            <w:proofErr w:type="gramStart"/>
+            <w:r>
+              <w:rPr>
+                <w:sz w:val="18"/>
+              </w:rPr>
+              <w:t>MD.DateReformeEXemplaire</w:t>
+            </w:r>
+            <w:proofErr w:type="gramEnd"/>
           </w:p>
         </w:tc>
         <w:tc>
@@ -3051,7 +4140,21 @@
               <w:rPr>
                 <w:sz w:val="18"/>
               </w:rPr>
-              <w:t>Date de réforme ; vide si l'exemplaire est en service</w:t>
+              <w:t xml:space="preserve">Date de </w:t>
+            </w:r>
+            <w:proofErr w:type="gramStart"/>
+            <w:r>
+              <w:rPr>
+                <w:sz w:val="18"/>
+              </w:rPr>
+              <w:t>réforme ;</w:t>
+            </w:r>
+            <w:proofErr w:type="gramEnd"/>
+            <w:r>
+              <w:rPr>
+                <w:sz w:val="18"/>
+              </w:rPr>
+              <w:t xml:space="preserve"> vide si l'exemplaire est en service</w:t>
             </w:r>
           </w:p>
         </w:tc>
@@ -3092,8 +4195,16 @@
               <w:rPr>
                 <w:sz w:val="18"/>
               </w:rPr>
-              <w:t>Exemplaire_MD.CodeProduit</w:t>
-            </w:r>
+              <w:t>Exemplaire_</w:t>
+            </w:r>
+            <w:proofErr w:type="gramStart"/>
+            <w:r>
+              <w:rPr>
+                <w:sz w:val="18"/>
+              </w:rPr>
+              <w:t>MD.CodeProduit</w:t>
+            </w:r>
+            <w:proofErr w:type="gramEnd"/>
           </w:p>
         </w:tc>
         <w:tc>
@@ -3114,11 +4225,19 @@
             <w:tcW w:w="1474" w:type="dxa"/>
           </w:tcPr>
           <w:p>
-            <w:r>
-              <w:rPr>
-                <w:sz w:val="18"/>
-              </w:rPr>
-              <w:t>NUMBER(10)</w:t>
+            <w:proofErr w:type="gramStart"/>
+            <w:r>
+              <w:rPr>
+                <w:sz w:val="18"/>
+              </w:rPr>
+              <w:t>NUMBER(</w:t>
+            </w:r>
+            <w:proofErr w:type="gramEnd"/>
+            <w:r>
+              <w:rPr>
+                <w:sz w:val="18"/>
+              </w:rPr>
+              <w:t>10)</w:t>
             </w:r>
           </w:p>
         </w:tc>
@@ -3146,8 +4265,16 @@
               <w:rPr>
                 <w:sz w:val="18"/>
               </w:rPr>
-              <w:t>Exemplaire_MD.NomProduit</w:t>
-            </w:r>
+              <w:t>Exemplaire_</w:t>
+            </w:r>
+            <w:proofErr w:type="gramStart"/>
+            <w:r>
+              <w:rPr>
+                <w:sz w:val="18"/>
+              </w:rPr>
+              <w:t>MD.NomProduit</w:t>
+            </w:r>
+            <w:proofErr w:type="gramEnd"/>
           </w:p>
         </w:tc>
         <w:tc>
@@ -3200,8 +4327,16 @@
               <w:rPr>
                 <w:sz w:val="18"/>
               </w:rPr>
-              <w:t>Exemplaire_MD.DescriptifProduit</w:t>
-            </w:r>
+              <w:t>Exemplaire_</w:t>
+            </w:r>
+            <w:proofErr w:type="gramStart"/>
+            <w:r>
+              <w:rPr>
+                <w:sz w:val="18"/>
+              </w:rPr>
+              <w:t>MD.DescriptifProduit</w:t>
+            </w:r>
+            <w:proofErr w:type="gramEnd"/>
           </w:p>
         </w:tc>
         <w:tc>
@@ -3254,8 +4389,16 @@
               <w:rPr>
                 <w:sz w:val="18"/>
               </w:rPr>
-              <w:t>Exemplaire_MD.PoidsKgProduit</w:t>
-            </w:r>
+              <w:t>Exemplaire_</w:t>
+            </w:r>
+            <w:proofErr w:type="gramStart"/>
+            <w:r>
+              <w:rPr>
+                <w:sz w:val="18"/>
+              </w:rPr>
+              <w:t>MD.PoidsKgProduit</w:t>
+            </w:r>
+            <w:proofErr w:type="gramEnd"/>
           </w:p>
         </w:tc>
         <w:tc>
@@ -3276,11 +4419,19 @@
             <w:tcW w:w="1474" w:type="dxa"/>
           </w:tcPr>
           <w:p>
-            <w:r>
-              <w:rPr>
-                <w:sz w:val="18"/>
-              </w:rPr>
-              <w:t>NUMBER(6,2)</w:t>
+            <w:proofErr w:type="gramStart"/>
+            <w:r>
+              <w:rPr>
+                <w:sz w:val="18"/>
+              </w:rPr>
+              <w:t>NUMBER(</w:t>
+            </w:r>
+            <w:proofErr w:type="gramEnd"/>
+            <w:r>
+              <w:rPr>
+                <w:sz w:val="18"/>
+              </w:rPr>
+              <w:t>6,2)</w:t>
             </w:r>
           </w:p>
         </w:tc>
@@ -3308,8 +4459,16 @@
               <w:rPr>
                 <w:sz w:val="18"/>
               </w:rPr>
-              <w:t>Exemplaire_MD.AutonomieKilometreProduit</w:t>
-            </w:r>
+              <w:t>Exemplaire_</w:t>
+            </w:r>
+            <w:proofErr w:type="gramStart"/>
+            <w:r>
+              <w:rPr>
+                <w:sz w:val="18"/>
+              </w:rPr>
+              <w:t>MD.AutonomieKilometreProduit</w:t>
+            </w:r>
+            <w:proofErr w:type="gramEnd"/>
           </w:p>
         </w:tc>
         <w:tc>
@@ -3330,11 +4489,19 @@
             <w:tcW w:w="1474" w:type="dxa"/>
           </w:tcPr>
           <w:p>
-            <w:r>
-              <w:rPr>
-                <w:sz w:val="18"/>
-              </w:rPr>
-              <w:t>NUMBER(5)</w:t>
+            <w:proofErr w:type="gramStart"/>
+            <w:r>
+              <w:rPr>
+                <w:sz w:val="18"/>
+              </w:rPr>
+              <w:t>NUMBER(</w:t>
+            </w:r>
+            <w:proofErr w:type="gramEnd"/>
+            <w:r>
+              <w:rPr>
+                <w:sz w:val="18"/>
+              </w:rPr>
+              <w:t>5)</w:t>
             </w:r>
           </w:p>
         </w:tc>
@@ -3362,8 +4529,16 @@
               <w:rPr>
                 <w:sz w:val="18"/>
               </w:rPr>
-              <w:t>Exemplaire_MD.MarqueProduit</w:t>
-            </w:r>
+              <w:t>Exemplaire_</w:t>
+            </w:r>
+            <w:proofErr w:type="gramStart"/>
+            <w:r>
+              <w:rPr>
+                <w:sz w:val="18"/>
+              </w:rPr>
+              <w:t>MD.MarqueProduit</w:t>
+            </w:r>
+            <w:proofErr w:type="gramEnd"/>
           </w:p>
         </w:tc>
         <w:tc>
@@ -3416,8 +4591,16 @@
               <w:rPr>
                 <w:sz w:val="18"/>
               </w:rPr>
-              <w:t>Exemplaire_MD.CodeGamme</w:t>
-            </w:r>
+              <w:t>Exemplaire_</w:t>
+            </w:r>
+            <w:proofErr w:type="gramStart"/>
+            <w:r>
+              <w:rPr>
+                <w:sz w:val="18"/>
+              </w:rPr>
+              <w:t>MD.CodeGamme</w:t>
+            </w:r>
+            <w:proofErr w:type="gramEnd"/>
           </w:p>
         </w:tc>
         <w:tc>
@@ -3438,11 +4621,19 @@
             <w:tcW w:w="1474" w:type="dxa"/>
           </w:tcPr>
           <w:p>
-            <w:r>
-              <w:rPr>
-                <w:sz w:val="18"/>
-              </w:rPr>
-              <w:t>CHAR(5)</w:t>
+            <w:proofErr w:type="gramStart"/>
+            <w:r>
+              <w:rPr>
+                <w:sz w:val="18"/>
+              </w:rPr>
+              <w:t>CHAR(</w:t>
+            </w:r>
+            <w:proofErr w:type="gramEnd"/>
+            <w:r>
+              <w:rPr>
+                <w:sz w:val="18"/>
+              </w:rPr>
+              <w:t>5)</w:t>
             </w:r>
           </w:p>
         </w:tc>
@@ -3470,8 +4661,16 @@
               <w:rPr>
                 <w:sz w:val="18"/>
               </w:rPr>
-              <w:t>Exemplaire_MD.NomGamme</w:t>
-            </w:r>
+              <w:t>Exemplaire_</w:t>
+            </w:r>
+            <w:proofErr w:type="gramStart"/>
+            <w:r>
+              <w:rPr>
+                <w:sz w:val="18"/>
+              </w:rPr>
+              <w:t>MD.NomGamme</w:t>
+            </w:r>
+            <w:proofErr w:type="gramEnd"/>
           </w:p>
         </w:tc>
         <w:tc>
@@ -3524,8 +4723,16 @@
               <w:rPr>
                 <w:sz w:val="18"/>
               </w:rPr>
-              <w:t>Exemplaire_MD.SecteurProduit</w:t>
-            </w:r>
+              <w:t>Exemplaire_</w:t>
+            </w:r>
+            <w:proofErr w:type="gramStart"/>
+            <w:r>
+              <w:rPr>
+                <w:sz w:val="18"/>
+              </w:rPr>
+              <w:t>MD.SecteurProduit</w:t>
+            </w:r>
+            <w:proofErr w:type="gramEnd"/>
           </w:p>
         </w:tc>
         <w:tc>
@@ -3578,8 +4785,16 @@
               <w:rPr>
                 <w:sz w:val="18"/>
               </w:rPr>
-              <w:t>Exemplaire_MD.CodeGeneration</w:t>
-            </w:r>
+              <w:t>Exemplaire_</w:t>
+            </w:r>
+            <w:proofErr w:type="gramStart"/>
+            <w:r>
+              <w:rPr>
+                <w:sz w:val="18"/>
+              </w:rPr>
+              <w:t>MD.CodeGeneration</w:t>
+            </w:r>
+            <w:proofErr w:type="gramEnd"/>
           </w:p>
         </w:tc>
         <w:tc>
@@ -3632,8 +4847,16 @@
               <w:rPr>
                 <w:sz w:val="18"/>
               </w:rPr>
-              <w:t>Exemplaire_MD.NomGeneration</w:t>
-            </w:r>
+              <w:t>Exemplaire_</w:t>
+            </w:r>
+            <w:proofErr w:type="gramStart"/>
+            <w:r>
+              <w:rPr>
+                <w:sz w:val="18"/>
+              </w:rPr>
+              <w:t>MD.NomGeneration</w:t>
+            </w:r>
+            <w:proofErr w:type="gramEnd"/>
           </w:p>
         </w:tc>
         <w:tc>
@@ -3686,8 +4909,16 @@
               <w:rPr>
                 <w:sz w:val="18"/>
               </w:rPr>
-              <w:t>Exemplaire_MD.DateSortieGeneration</w:t>
-            </w:r>
+              <w:t>Exemplaire_</w:t>
+            </w:r>
+            <w:proofErr w:type="gramStart"/>
+            <w:r>
+              <w:rPr>
+                <w:sz w:val="18"/>
+              </w:rPr>
+              <w:t>MD.DateSortieGeneration</w:t>
+            </w:r>
+            <w:proofErr w:type="gramEnd"/>
           </w:p>
         </w:tc>
         <w:tc>
@@ -3740,8 +4971,16 @@
               <w:rPr>
                 <w:sz w:val="18"/>
               </w:rPr>
-              <w:t>Exemplaire_MD.DateArretGeneration</w:t>
-            </w:r>
+              <w:t>Exemplaire_</w:t>
+            </w:r>
+            <w:proofErr w:type="gramStart"/>
+            <w:r>
+              <w:rPr>
+                <w:sz w:val="18"/>
+              </w:rPr>
+              <w:t>MD.DateArretGeneration</w:t>
+            </w:r>
+            <w:proofErr w:type="gramEnd"/>
           </w:p>
         </w:tc>
         <w:tc>
@@ -3753,7 +4992,21 @@
               <w:rPr>
                 <w:sz w:val="18"/>
               </w:rPr>
-              <w:t>Date d'arrêt ; vide si la génération est encore commercialisée</w:t>
+              <w:t xml:space="preserve">Date </w:t>
+            </w:r>
+            <w:proofErr w:type="gramStart"/>
+            <w:r>
+              <w:rPr>
+                <w:sz w:val="18"/>
+              </w:rPr>
+              <w:t>d'arrêt ;</w:t>
+            </w:r>
+            <w:proofErr w:type="gramEnd"/>
+            <w:r>
+              <w:rPr>
+                <w:sz w:val="18"/>
+              </w:rPr>
+              <w:t xml:space="preserve"> vide si la génération est encore commercialisée</w:t>
             </w:r>
           </w:p>
         </w:tc>
@@ -3794,8 +5047,16 @@
               <w:rPr>
                 <w:sz w:val="18"/>
               </w:rPr>
-              <w:t>Exemplaire_MD.CodeFabricant</w:t>
-            </w:r>
+              <w:t>Exemplaire_</w:t>
+            </w:r>
+            <w:proofErr w:type="gramStart"/>
+            <w:r>
+              <w:rPr>
+                <w:sz w:val="18"/>
+              </w:rPr>
+              <w:t>MD.CodeFabricant</w:t>
+            </w:r>
+            <w:proofErr w:type="gramEnd"/>
           </w:p>
         </w:tc>
         <w:tc>
@@ -3848,8 +5109,16 @@
               <w:rPr>
                 <w:sz w:val="18"/>
               </w:rPr>
-              <w:t>Exemplaire_MD.NomFabricant</w:t>
-            </w:r>
+              <w:t>Exemplaire_</w:t>
+            </w:r>
+            <w:proofErr w:type="gramStart"/>
+            <w:r>
+              <w:rPr>
+                <w:sz w:val="18"/>
+              </w:rPr>
+              <w:t>MD.NomFabricant</w:t>
+            </w:r>
+            <w:proofErr w:type="gramEnd"/>
           </w:p>
         </w:tc>
         <w:tc>
@@ -3902,8 +5171,16 @@
               <w:rPr>
                 <w:sz w:val="18"/>
               </w:rPr>
-              <w:t>Exemplaire_MD.PaysFabricant</w:t>
-            </w:r>
+              <w:t>Exemplaire_</w:t>
+            </w:r>
+            <w:proofErr w:type="gramStart"/>
+            <w:r>
+              <w:rPr>
+                <w:sz w:val="18"/>
+              </w:rPr>
+              <w:t>MD.PaysFabricant</w:t>
+            </w:r>
+            <w:proofErr w:type="gramEnd"/>
           </w:p>
         </w:tc>
         <w:tc>

</xml_diff>

<commit_message>
Magasin Location : TypeKreis et TypeLand en niveaux de hierarchie (H_Type_Kreis, H_Type_Land)
Co-Authored-By: Claude Sonnet 5.5 <noreply@anthropic.com>
Claude-Session: https://claude.ai/code/session_01DCpKdazzv8zUzKmMSEAPKH
</commit_message>
<xml_diff>
--- a/docs/Dictionnaire_Location_MD.docx
+++ b/docs/Dictionnaire_Location_MD.docx
@@ -2977,90 +2977,18 @@
               <w:rPr>
                 <w:sz w:val="18"/>
               </w:rPr>
-              <w:t>Type du Kreis (</w:t>
-            </w:r>
-            <w:r>
-              <w:rPr>
-                <w:sz w:val="18"/>
-              </w:rPr>
-              <w:t xml:space="preserve">‘Landkreis’ </w:t>
+              <w:t>Type du Kreis : 'Landkreis' ou 'Kreisfreie Stadt' ; vide pour la France. Paramètre de la hiérarchie H_Type_Kreis (CodeKreis → TypeKreis).</w:t>
             </w:r>
             <w:proofErr w:type="spellStart"/>
-            <w:r>
-              <w:rPr>
-                <w:sz w:val="18"/>
-              </w:rPr>
-              <w:t>ou</w:t>
-            </w:r>
             <w:proofErr w:type="spellEnd"/>
-            <w:r>
-              <w:rPr>
-                <w:sz w:val="18"/>
-              </w:rPr>
-              <w:t xml:space="preserve"> ‘</w:t>
-            </w:r>
             <w:proofErr w:type="spellStart"/>
-            <w:r>
-              <w:rPr>
-                <w:sz w:val="18"/>
-              </w:rPr>
-              <w:t>Kreisfreie</w:t>
-            </w:r>
             <w:proofErr w:type="spellEnd"/>
-            <w:r>
-              <w:rPr>
-                <w:sz w:val="18"/>
-              </w:rPr>
-              <w:t xml:space="preserve"> Stadt’</w:t>
-            </w:r>
-            <w:r>
-              <w:rPr>
-                <w:sz w:val="18"/>
-              </w:rPr>
-              <w:t xml:space="preserve">), </w:t>
-            </w:r>
             <w:proofErr w:type="spellStart"/>
-            <w:r>
-              <w:rPr>
-                <w:sz w:val="18"/>
-              </w:rPr>
-              <w:t>selon</w:t>
-            </w:r>
             <w:proofErr w:type="spellEnd"/>
-            <w:r>
-              <w:rPr>
-                <w:sz w:val="18"/>
-              </w:rPr>
-              <w:t xml:space="preserve"> le </w:t>
-            </w:r>
             <w:proofErr w:type="spellStart"/>
-            <w:r>
-              <w:rPr>
-                <w:sz w:val="18"/>
-              </w:rPr>
-              <w:t>fichier</w:t>
-            </w:r>
             <w:proofErr w:type="spellEnd"/>
-            <w:r>
-              <w:rPr>
-                <w:sz w:val="18"/>
-              </w:rPr>
-              <w:t xml:space="preserve"> </w:t>
-            </w:r>
             <w:proofErr w:type="gramStart"/>
-            <w:r>
-              <w:rPr>
-                <w:sz w:val="18"/>
-              </w:rPr>
-              <w:t>source ;</w:t>
-            </w:r>
             <w:proofErr w:type="gramEnd"/>
-            <w:r>
-              <w:rPr>
-                <w:sz w:val="18"/>
-              </w:rPr>
-              <w:t xml:space="preserve"> vide pour la France.</w:t>
-            </w:r>
           </w:p>
         </w:tc>
         <w:tc>
@@ -3550,50 +3478,14 @@
               <w:rPr>
                 <w:sz w:val="18"/>
               </w:rPr>
-              <w:t xml:space="preserve">Type du </w:t>
+              <w:t>Type du Land : 'Stadtstaat' (ville-État : Berlin, Hamburg, Bremen) ou 'Flächenland' ; vide pour la France. Paramètre de la hiérarchie H_Type_Land (CodeLand → TypeLand).</w:t>
             </w:r>
             <w:proofErr w:type="gramStart"/>
-            <w:r>
-              <w:rPr>
-                <w:sz w:val="18"/>
-              </w:rPr>
-              <w:t>Land :</w:t>
-            </w:r>
             <w:proofErr w:type="gramEnd"/>
-            <w:r>
-              <w:rPr>
-                <w:sz w:val="18"/>
-              </w:rPr>
-              <w:t xml:space="preserve"> 'Stadtstaat' (ville-</w:t>
-            </w:r>
             <w:proofErr w:type="gramStart"/>
-            <w:r>
-              <w:rPr>
-                <w:sz w:val="18"/>
-              </w:rPr>
-              <w:t>État :</w:t>
-            </w:r>
             <w:proofErr w:type="gramEnd"/>
-            <w:r>
-              <w:rPr>
-                <w:sz w:val="18"/>
-              </w:rPr>
-              <w:t xml:space="preserve"> Berlin, Hamburg, Bremen) ou 'Flächenland' (Land territorial</w:t>
-            </w:r>
             <w:proofErr w:type="gramStart"/>
-            <w:r>
-              <w:rPr>
-                <w:sz w:val="18"/>
-              </w:rPr>
-              <w:t>) ;</w:t>
-            </w:r>
             <w:proofErr w:type="gramEnd"/>
-            <w:r>
-              <w:rPr>
-                <w:sz w:val="18"/>
-              </w:rPr>
-              <w:t xml:space="preserve"> vide pour la France.</w:t>
-            </w:r>
           </w:p>
         </w:tc>
         <w:tc>

</xml_diff>